<commit_message>
fix: Resolve missing mappings across all templates (luas_lahan, hari_kerja, jam_operasional) and fix bap-sppg docx tag
</commit_message>
<xml_diff>
--- a/public/templates-bap/bap-sppg.docx
+++ b/public/templates-bap/bap-sppg.docx
@@ -5469,25 +5469,7 @@
           <w:sz w:val="24"/>
           <w:szCs w:val="24"/>
         </w:rPr>
-        <w:t>{abjad}. {</w:t>
-      </w:r>
-      <w:proofErr w:type="spellStart"/>
-      <w:r>
-        <w:rPr>
-          <w:rFonts w:ascii="Arial Nova Cond" w:hAnsi="Arial Nova Cond"/>
-          <w:sz w:val="24"/>
-          <w:szCs w:val="24"/>
-        </w:rPr>
-        <w:t>saran_text</w:t>
-      </w:r>
-      <w:proofErr w:type="spellEnd"/>
-      <w:r>
-        <w:rPr>
-          <w:rFonts w:ascii="Arial Nova Cond" w:hAnsi="Arial Nova Cond"/>
-          <w:sz w:val="24"/>
-          <w:szCs w:val="24"/>
-        </w:rPr>
-        <w:t>}</w:t>
+        <w:t>{abjad}. {saran_text}</w:t>
       </w:r>
     </w:p>
     <w:p>

</xml_diff>

<commit_message>
feat: arsip hub, peta koordinat, logo, and bap fixes
</commit_message>
<xml_diff>
--- a/public/templates-bap/bap-sppg.docx
+++ b/public/templates-bap/bap-sppg.docx
@@ -43,7 +43,7 @@
                 <w:lang w:val="en-US"/>
               </w:rPr>
               <w:drawing>
-                <wp:anchor distT="0" distB="0" distL="114300" distR="114300" simplePos="0" relativeHeight="251658752" behindDoc="0" locked="0" layoutInCell="1" allowOverlap="1" wp14:anchorId="069080DA" wp14:editId="1217BC9C">
+                <wp:anchor distT="0" distB="0" distL="114300" distR="114300" simplePos="0" relativeHeight="251658752" behindDoc="0" locked="0" layoutInCell="1" allowOverlap="1" wp14:anchorId="069080DA" wp14:editId="1053E579">
                   <wp:simplePos x="0" y="0"/>
                   <wp:positionH relativeFrom="column">
                     <wp:posOffset>68580</wp:posOffset>
@@ -5550,17 +5550,6 @@
         <w:t>sebagai berikut :</w:t>
       </w:r>
     </w:p>
-    <w:p>
-      <w:pPr>
-        <w:spacing w:after="0" w:line="240" w:lineRule="auto"/>
-        <w:rPr>
-          <w:rFonts w:ascii="Arial Nova Cond" w:hAnsi="Arial Nova Cond"/>
-          <w:color w:val="FF0000"/>
-          <w:sz w:val="24"/>
-          <w:szCs w:val="24"/>
-        </w:rPr>
-      </w:pPr>
-    </w:p>
     <w:tbl>
       <w:tblPr>
         <w:tblStyle w:val="TableGrid"/>
@@ -5662,7 +5651,27 @@
                 <w:sz w:val="24"/>
                 <w:szCs w:val="24"/>
               </w:rPr>
-              <w:t>{pj_nama}</w:t>
+              <w:t>{</w:t>
+            </w:r>
+            <w:proofErr w:type="spellStart"/>
+            <w:r>
+              <w:rPr>
+                <w:rFonts w:ascii="Arial Nova Cond" w:hAnsi="Arial Nova Cond"/>
+                <w:color w:val="0D0D0D"/>
+                <w:sz w:val="24"/>
+                <w:szCs w:val="24"/>
+              </w:rPr>
+              <w:t>pj_nama</w:t>
+            </w:r>
+            <w:proofErr w:type="spellEnd"/>
+            <w:r>
+              <w:rPr>
+                <w:rFonts w:ascii="Arial Nova Cond" w:hAnsi="Arial Nova Cond"/>
+                <w:color w:val="0D0D0D"/>
+                <w:sz w:val="24"/>
+                <w:szCs w:val="24"/>
+              </w:rPr>
+              <w:t>}</w:t>
             </w:r>
           </w:p>
         </w:tc>
@@ -5697,6 +5706,7 @@
                 <w:szCs w:val="24"/>
               </w:rPr>
             </w:pPr>
+            <w:proofErr w:type="spellStart"/>
             <w:r>
               <w:rPr>
                 <w:rFonts w:ascii="Arial Nova Cond" w:hAnsi="Arial Nova Cond"/>
@@ -5705,6 +5715,7 @@
               </w:rPr>
               <w:t>Jabatan</w:t>
             </w:r>
+            <w:proofErr w:type="spellEnd"/>
           </w:p>
         </w:tc>
         <w:tc>
@@ -5747,7 +5758,25 @@
                 <w:sz w:val="24"/>
                 <w:szCs w:val="24"/>
               </w:rPr>
-              <w:t>{pj_jabatan}</w:t>
+              <w:t>{</w:t>
+            </w:r>
+            <w:proofErr w:type="spellStart"/>
+            <w:r>
+              <w:rPr>
+                <w:rFonts w:ascii="Arial Nova Cond" w:hAnsi="Arial Nova Cond"/>
+                <w:sz w:val="24"/>
+                <w:szCs w:val="24"/>
+              </w:rPr>
+              <w:t>pj_jabatan</w:t>
+            </w:r>
+            <w:proofErr w:type="spellEnd"/>
+            <w:r>
+              <w:rPr>
+                <w:rFonts w:ascii="Arial Nova Cond" w:hAnsi="Arial Nova Cond"/>
+                <w:sz w:val="24"/>
+                <w:szCs w:val="24"/>
+              </w:rPr>
+              <w:t>}</w:t>
             </w:r>
           </w:p>
         </w:tc>
@@ -5782,13 +5811,23 @@
                 <w:szCs w:val="24"/>
               </w:rPr>
             </w:pPr>
-            <w:r>
-              <w:rPr>
-                <w:rFonts w:ascii="Arial Nova Cond" w:hAnsi="Arial Nova Cond"/>
-                <w:sz w:val="24"/>
-                <w:szCs w:val="24"/>
-              </w:rPr>
-              <w:t>Nomor HP</w:t>
+            <w:proofErr w:type="spellStart"/>
+            <w:r>
+              <w:rPr>
+                <w:rFonts w:ascii="Arial Nova Cond" w:hAnsi="Arial Nova Cond"/>
+                <w:sz w:val="24"/>
+                <w:szCs w:val="24"/>
+              </w:rPr>
+              <w:t>Nomor</w:t>
+            </w:r>
+            <w:proofErr w:type="spellEnd"/>
+            <w:r>
+              <w:rPr>
+                <w:rFonts w:ascii="Arial Nova Cond" w:hAnsi="Arial Nova Cond"/>
+                <w:sz w:val="24"/>
+                <w:szCs w:val="24"/>
+              </w:rPr>
+              <w:t xml:space="preserve"> HP</w:t>
             </w:r>
           </w:p>
         </w:tc>
@@ -5832,7 +5871,25 @@
                 <w:sz w:val="24"/>
                 <w:szCs w:val="24"/>
               </w:rPr>
-              <w:t>{telepon}</w:t>
+              <w:t>{</w:t>
+            </w:r>
+            <w:proofErr w:type="spellStart"/>
+            <w:r>
+              <w:rPr>
+                <w:rFonts w:ascii="Arial Nova Cond" w:hAnsi="Arial Nova Cond"/>
+                <w:sz w:val="24"/>
+                <w:szCs w:val="24"/>
+              </w:rPr>
+              <w:t>telepon</w:t>
+            </w:r>
+            <w:proofErr w:type="spellEnd"/>
+            <w:r>
+              <w:rPr>
+                <w:rFonts w:ascii="Arial Nova Cond" w:hAnsi="Arial Nova Cond"/>
+                <w:sz w:val="24"/>
+                <w:szCs w:val="24"/>
+              </w:rPr>
+              <w:t>}</w:t>
             </w:r>
           </w:p>
         </w:tc>
@@ -5873,8 +5930,18 @@
                 <w:sz w:val="24"/>
                 <w:szCs w:val="24"/>
               </w:rPr>
-              <w:t>Tanda tangan</w:t>
-            </w:r>
+              <w:t xml:space="preserve">Tanda </w:t>
+            </w:r>
+            <w:proofErr w:type="spellStart"/>
+            <w:r>
+              <w:rPr>
+                <w:rFonts w:ascii="Arial Nova Cond" w:hAnsi="Arial Nova Cond"/>
+                <w:sz w:val="24"/>
+                <w:szCs w:val="24"/>
+              </w:rPr>
+              <w:t>tangan</w:t>
+            </w:r>
+            <w:proofErr w:type="spellEnd"/>
           </w:p>
         </w:tc>
         <w:tc>
@@ -5920,14 +5987,449 @@
                 <w:szCs w:val="24"/>
               </w:rPr>
             </w:pPr>
-            <w:r>
-              <w:rPr>
-                <w:rFonts w:ascii="Arial Nova Cond" w:hAnsi="Arial Nova Cond"/>
-                <w:sz w:val="24"/>
-                <w:szCs w:val="24"/>
-              </w:rPr>
-              <w:t>{%ttd_pemrakarsa}</w:t>
-            </w:r>
+          </w:p>
+          <w:p>
+            <w:pPr>
+              <w:rPr>
+                <w:rFonts w:ascii="Arial Nova Cond" w:hAnsi="Arial Nova Cond"/>
+                <w:sz w:val="24"/>
+                <w:szCs w:val="24"/>
+              </w:rPr>
+            </w:pPr>
+          </w:p>
+          <w:p>
+            <w:pPr>
+              <w:rPr>
+                <w:rFonts w:ascii="Arial Nova Cond" w:hAnsi="Arial Nova Cond"/>
+                <w:sz w:val="24"/>
+                <w:szCs w:val="24"/>
+              </w:rPr>
+            </w:pPr>
+          </w:p>
+        </w:tc>
+      </w:tr>
+      <w:tr>
+        <w:trPr>
+          <w:trHeight w:val="258"/>
+        </w:trPr>
+        <w:tc>
+          <w:tcPr>
+            <w:tcW w:w="421" w:type="dxa"/>
+          </w:tcPr>
+          <w:p>
+            <w:pPr>
+              <w:rPr>
+                <w:rFonts w:ascii="Arial Nova Cond" w:hAnsi="Arial Nova Cond"/>
+                <w:sz w:val="24"/>
+                <w:szCs w:val="24"/>
+              </w:rPr>
+            </w:pPr>
+            <w:r>
+              <w:rPr>
+                <w:rFonts w:ascii="Arial Nova Cond" w:hAnsi="Arial Nova Cond"/>
+                <w:sz w:val="24"/>
+                <w:szCs w:val="24"/>
+              </w:rPr>
+              <w:t>2.</w:t>
+            </w:r>
+          </w:p>
+        </w:tc>
+        <w:tc>
+          <w:tcPr>
+            <w:tcW w:w="1984" w:type="dxa"/>
+          </w:tcPr>
+          <w:p>
+            <w:pPr>
+              <w:rPr>
+                <w:rFonts w:ascii="Arial Nova Cond" w:hAnsi="Arial Nova Cond"/>
+                <w:sz w:val="24"/>
+                <w:szCs w:val="24"/>
+              </w:rPr>
+            </w:pPr>
+            <w:r>
+              <w:rPr>
+                <w:rFonts w:ascii="Arial Nova Cond" w:hAnsi="Arial Nova Cond"/>
+                <w:sz w:val="24"/>
+                <w:szCs w:val="24"/>
+              </w:rPr>
+              <w:t>Nama</w:t>
+            </w:r>
+          </w:p>
+        </w:tc>
+        <w:tc>
+          <w:tcPr>
+            <w:tcW w:w="284" w:type="dxa"/>
+          </w:tcPr>
+          <w:p>
+            <w:pPr>
+              <w:rPr>
+                <w:rFonts w:ascii="Arial Nova Cond" w:hAnsi="Arial Nova Cond"/>
+                <w:sz w:val="24"/>
+                <w:szCs w:val="24"/>
+              </w:rPr>
+            </w:pPr>
+            <w:r>
+              <w:rPr>
+                <w:rFonts w:ascii="Arial Nova Cond" w:hAnsi="Arial Nova Cond"/>
+                <w:sz w:val="24"/>
+                <w:szCs w:val="24"/>
+              </w:rPr>
+              <w:t>:</w:t>
+            </w:r>
+          </w:p>
+        </w:tc>
+        <w:tc>
+          <w:tcPr>
+            <w:tcW w:w="6940" w:type="dxa"/>
+          </w:tcPr>
+          <w:p>
+            <w:pPr>
+              <w:rPr>
+                <w:rFonts w:ascii="Arial Nova Cond" w:hAnsi="Arial Nova Cond"/>
+                <w:sz w:val="24"/>
+                <w:szCs w:val="24"/>
+              </w:rPr>
+            </w:pPr>
+            <w:r>
+              <w:rPr>
+                <w:rFonts w:ascii="Arial Nova Cond" w:hAnsi="Arial Nova Cond"/>
+                <w:sz w:val="24"/>
+                <w:szCs w:val="24"/>
+              </w:rPr>
+              <w:t>{</w:t>
+            </w:r>
+            <w:proofErr w:type="spellStart"/>
+            <w:r>
+              <w:rPr>
+                <w:rFonts w:ascii="Arial Nova Cond" w:hAnsi="Arial Nova Cond"/>
+                <w:sz w:val="24"/>
+                <w:szCs w:val="24"/>
+              </w:rPr>
+              <w:t>nama_perwakilan</w:t>
+            </w:r>
+            <w:proofErr w:type="spellEnd"/>
+            <w:r>
+              <w:rPr>
+                <w:rFonts w:ascii="Arial Nova Cond" w:hAnsi="Arial Nova Cond"/>
+                <w:sz w:val="24"/>
+                <w:szCs w:val="24"/>
+              </w:rPr>
+              <w:t>}</w:t>
+            </w:r>
+          </w:p>
+        </w:tc>
+      </w:tr>
+      <w:tr>
+        <w:trPr>
+          <w:trHeight w:val="266"/>
+        </w:trPr>
+        <w:tc>
+          <w:tcPr>
+            <w:tcW w:w="421" w:type="dxa"/>
+          </w:tcPr>
+          <w:p>
+            <w:pPr>
+              <w:rPr>
+                <w:rFonts w:ascii="Arial Nova Cond" w:hAnsi="Arial Nova Cond"/>
+                <w:sz w:val="24"/>
+                <w:szCs w:val="24"/>
+              </w:rPr>
+            </w:pPr>
+          </w:p>
+        </w:tc>
+        <w:tc>
+          <w:tcPr>
+            <w:tcW w:w="1984" w:type="dxa"/>
+          </w:tcPr>
+          <w:p>
+            <w:pPr>
+              <w:rPr>
+                <w:rFonts w:ascii="Arial Nova Cond" w:hAnsi="Arial Nova Cond"/>
+                <w:sz w:val="24"/>
+                <w:szCs w:val="24"/>
+              </w:rPr>
+            </w:pPr>
+            <w:proofErr w:type="spellStart"/>
+            <w:r>
+              <w:rPr>
+                <w:rFonts w:ascii="Arial Nova Cond" w:hAnsi="Arial Nova Cond"/>
+                <w:sz w:val="24"/>
+                <w:szCs w:val="24"/>
+              </w:rPr>
+              <w:t>Jabatan</w:t>
+            </w:r>
+            <w:proofErr w:type="spellEnd"/>
+          </w:p>
+        </w:tc>
+        <w:tc>
+          <w:tcPr>
+            <w:tcW w:w="284" w:type="dxa"/>
+          </w:tcPr>
+          <w:p>
+            <w:pPr>
+              <w:rPr>
+                <w:rFonts w:ascii="Arial Nova Cond" w:hAnsi="Arial Nova Cond"/>
+                <w:sz w:val="24"/>
+                <w:szCs w:val="24"/>
+              </w:rPr>
+            </w:pPr>
+            <w:r>
+              <w:rPr>
+                <w:rFonts w:ascii="Arial Nova Cond" w:hAnsi="Arial Nova Cond"/>
+                <w:sz w:val="24"/>
+                <w:szCs w:val="24"/>
+              </w:rPr>
+              <w:t>:</w:t>
+            </w:r>
+          </w:p>
+        </w:tc>
+        <w:tc>
+          <w:tcPr>
+            <w:tcW w:w="6940" w:type="dxa"/>
+          </w:tcPr>
+          <w:p>
+            <w:pPr>
+              <w:rPr>
+                <w:rFonts w:ascii="Arial Nova Cond" w:hAnsi="Arial Nova Cond"/>
+                <w:sz w:val="24"/>
+                <w:szCs w:val="24"/>
+              </w:rPr>
+            </w:pPr>
+            <w:r>
+              <w:rPr>
+                <w:rFonts w:ascii="Arial Nova Cond" w:hAnsi="Arial Nova Cond"/>
+                <w:sz w:val="24"/>
+                <w:szCs w:val="24"/>
+              </w:rPr>
+              <w:t>{</w:t>
+            </w:r>
+            <w:proofErr w:type="spellStart"/>
+            <w:r>
+              <w:rPr>
+                <w:rFonts w:ascii="Arial Nova Cond" w:hAnsi="Arial Nova Cond"/>
+                <w:sz w:val="24"/>
+                <w:szCs w:val="24"/>
+              </w:rPr>
+              <w:t>jabatan_perwakilan</w:t>
+            </w:r>
+            <w:proofErr w:type="spellEnd"/>
+            <w:r>
+              <w:rPr>
+                <w:rFonts w:ascii="Arial Nova Cond" w:hAnsi="Arial Nova Cond"/>
+                <w:sz w:val="24"/>
+                <w:szCs w:val="24"/>
+              </w:rPr>
+              <w:t>}</w:t>
+            </w:r>
+          </w:p>
+        </w:tc>
+      </w:tr>
+      <w:tr>
+        <w:trPr>
+          <w:trHeight w:val="258"/>
+        </w:trPr>
+        <w:tc>
+          <w:tcPr>
+            <w:tcW w:w="421" w:type="dxa"/>
+          </w:tcPr>
+          <w:p>
+            <w:pPr>
+              <w:rPr>
+                <w:rFonts w:ascii="Arial Nova Cond" w:hAnsi="Arial Nova Cond"/>
+                <w:sz w:val="24"/>
+                <w:szCs w:val="24"/>
+              </w:rPr>
+            </w:pPr>
+          </w:p>
+        </w:tc>
+        <w:tc>
+          <w:tcPr>
+            <w:tcW w:w="1984" w:type="dxa"/>
+          </w:tcPr>
+          <w:p>
+            <w:pPr>
+              <w:rPr>
+                <w:rFonts w:ascii="Arial Nova Cond" w:hAnsi="Arial Nova Cond"/>
+                <w:sz w:val="24"/>
+                <w:szCs w:val="24"/>
+              </w:rPr>
+            </w:pPr>
+            <w:proofErr w:type="spellStart"/>
+            <w:r>
+              <w:rPr>
+                <w:rFonts w:ascii="Arial Nova Cond" w:hAnsi="Arial Nova Cond"/>
+                <w:sz w:val="24"/>
+                <w:szCs w:val="24"/>
+              </w:rPr>
+              <w:t>Nomor</w:t>
+            </w:r>
+            <w:proofErr w:type="spellEnd"/>
+            <w:r>
+              <w:rPr>
+                <w:rFonts w:ascii="Arial Nova Cond" w:hAnsi="Arial Nova Cond"/>
+                <w:sz w:val="24"/>
+                <w:szCs w:val="24"/>
+              </w:rPr>
+              <w:t xml:space="preserve"> HP</w:t>
+            </w:r>
+          </w:p>
+        </w:tc>
+        <w:tc>
+          <w:tcPr>
+            <w:tcW w:w="284" w:type="dxa"/>
+          </w:tcPr>
+          <w:p>
+            <w:pPr>
+              <w:rPr>
+                <w:rFonts w:ascii="Arial Nova Cond" w:hAnsi="Arial Nova Cond"/>
+                <w:sz w:val="24"/>
+                <w:szCs w:val="24"/>
+              </w:rPr>
+            </w:pPr>
+            <w:r>
+              <w:rPr>
+                <w:rFonts w:ascii="Arial Nova Cond" w:hAnsi="Arial Nova Cond"/>
+                <w:sz w:val="24"/>
+                <w:szCs w:val="24"/>
+              </w:rPr>
+              <w:t>:</w:t>
+            </w:r>
+          </w:p>
+        </w:tc>
+        <w:tc>
+          <w:tcPr>
+            <w:tcW w:w="6940" w:type="dxa"/>
+          </w:tcPr>
+          <w:p>
+            <w:pPr>
+              <w:rPr>
+                <w:rFonts w:ascii="Arial Nova Cond" w:hAnsi="Arial Nova Cond"/>
+                <w:sz w:val="24"/>
+                <w:szCs w:val="24"/>
+              </w:rPr>
+            </w:pPr>
+            <w:r>
+              <w:rPr>
+                <w:rFonts w:ascii="Arial Nova Cond" w:hAnsi="Arial Nova Cond"/>
+                <w:sz w:val="24"/>
+                <w:szCs w:val="24"/>
+              </w:rPr>
+              <w:t>{</w:t>
+            </w:r>
+            <w:proofErr w:type="spellStart"/>
+            <w:r>
+              <w:rPr>
+                <w:rFonts w:ascii="Arial Nova Cond" w:hAnsi="Arial Nova Cond"/>
+                <w:sz w:val="24"/>
+                <w:szCs w:val="24"/>
+              </w:rPr>
+              <w:t>telepon_perwakilan</w:t>
+            </w:r>
+            <w:proofErr w:type="spellEnd"/>
+            <w:r>
+              <w:rPr>
+                <w:rFonts w:ascii="Arial Nova Cond" w:hAnsi="Arial Nova Cond"/>
+                <w:sz w:val="24"/>
+                <w:szCs w:val="24"/>
+              </w:rPr>
+              <w:t>}</w:t>
+            </w:r>
+          </w:p>
+        </w:tc>
+      </w:tr>
+      <w:tr>
+        <w:trPr>
+          <w:trHeight w:val="526"/>
+        </w:trPr>
+        <w:tc>
+          <w:tcPr>
+            <w:tcW w:w="421" w:type="dxa"/>
+          </w:tcPr>
+          <w:p>
+            <w:pPr>
+              <w:rPr>
+                <w:rFonts w:ascii="Arial Nova Cond" w:hAnsi="Arial Nova Cond"/>
+                <w:sz w:val="24"/>
+                <w:szCs w:val="24"/>
+              </w:rPr>
+            </w:pPr>
+          </w:p>
+        </w:tc>
+        <w:tc>
+          <w:tcPr>
+            <w:tcW w:w="1984" w:type="dxa"/>
+          </w:tcPr>
+          <w:p>
+            <w:pPr>
+              <w:rPr>
+                <w:rFonts w:ascii="Arial Nova Cond" w:hAnsi="Arial Nova Cond"/>
+                <w:sz w:val="24"/>
+                <w:szCs w:val="24"/>
+              </w:rPr>
+            </w:pPr>
+            <w:r>
+              <w:rPr>
+                <w:rFonts w:ascii="Arial Nova Cond" w:hAnsi="Arial Nova Cond"/>
+                <w:sz w:val="24"/>
+                <w:szCs w:val="24"/>
+              </w:rPr>
+              <w:t xml:space="preserve">Tanda </w:t>
+            </w:r>
+            <w:proofErr w:type="spellStart"/>
+            <w:r>
+              <w:rPr>
+                <w:rFonts w:ascii="Arial Nova Cond" w:hAnsi="Arial Nova Cond"/>
+                <w:sz w:val="24"/>
+                <w:szCs w:val="24"/>
+              </w:rPr>
+              <w:t>tangan</w:t>
+            </w:r>
+            <w:proofErr w:type="spellEnd"/>
+          </w:p>
+        </w:tc>
+        <w:tc>
+          <w:tcPr>
+            <w:tcW w:w="284" w:type="dxa"/>
+          </w:tcPr>
+          <w:p>
+            <w:pPr>
+              <w:rPr>
+                <w:rFonts w:ascii="Arial Nova Cond" w:hAnsi="Arial Nova Cond"/>
+                <w:sz w:val="24"/>
+                <w:szCs w:val="24"/>
+              </w:rPr>
+            </w:pPr>
+            <w:r>
+              <w:rPr>
+                <w:rFonts w:ascii="Arial Nova Cond" w:hAnsi="Arial Nova Cond"/>
+                <w:sz w:val="24"/>
+                <w:szCs w:val="24"/>
+              </w:rPr>
+              <w:t>:</w:t>
+            </w:r>
+          </w:p>
+        </w:tc>
+        <w:tc>
+          <w:tcPr>
+            <w:tcW w:w="6940" w:type="dxa"/>
+          </w:tcPr>
+          <w:p>
+            <w:pPr>
+              <w:rPr>
+                <w:rFonts w:ascii="Arial Nova Cond" w:hAnsi="Arial Nova Cond"/>
+                <w:sz w:val="24"/>
+                <w:szCs w:val="24"/>
+              </w:rPr>
+            </w:pPr>
+          </w:p>
+          <w:p>
+            <w:pPr>
+              <w:rPr>
+                <w:rFonts w:ascii="Arial Nova Cond" w:hAnsi="Arial Nova Cond"/>
+                <w:sz w:val="24"/>
+                <w:szCs w:val="24"/>
+              </w:rPr>
+            </w:pPr>
           </w:p>
           <w:p>
             <w:pPr>
@@ -5941,6 +6443,17 @@
         </w:tc>
       </w:tr>
     </w:tbl>
+    <w:p>
+      <w:pPr>
+        <w:spacing w:after="0" w:line="240" w:lineRule="auto"/>
+        <w:rPr>
+          <w:rFonts w:ascii="Arial Nova Cond" w:hAnsi="Arial Nova Cond"/>
+          <w:color w:val="FF0000"/>
+          <w:sz w:val="24"/>
+          <w:szCs w:val="24"/>
+        </w:rPr>
+      </w:pPr>
+    </w:p>
     <w:p>
       <w:pPr>
         <w:pStyle w:val="Heading2"/>
@@ -5959,6 +6472,28 @@
     </w:p>
     <w:p>
       <w:pPr>
+        <w:rPr>
+          <w:rFonts w:ascii="Arial Nova Cond" w:eastAsia="Times New Roman" w:hAnsi="Arial Nova Cond" w:cs="Times New Roman"/>
+          <w:color w:val="0D0D0D"/>
+          <w:sz w:val="24"/>
+          <w:szCs w:val="24"/>
+          <w:lang w:eastAsia="en-ID"/>
+        </w:rPr>
+      </w:pPr>
+      <w:r>
+        <w:rPr>
+          <w:rFonts w:ascii="Arial Nova Cond" w:hAnsi="Arial Nova Cond"/>
+          <w:b/>
+          <w:bCs/>
+          <w:color w:val="0D0D0D"/>
+          <w:sz w:val="24"/>
+          <w:szCs w:val="24"/>
+        </w:rPr>
+        <w:br w:type="page"/>
+      </w:r>
+    </w:p>
+    <w:p>
+      <w:pPr>
         <w:pStyle w:val="Heading2"/>
         <w:shd w:val="clear" w:color="auto" w:fill="FFFFFF"/>
         <w:spacing w:before="0" w:beforeAutospacing="0" w:after="0" w:afterAutospacing="0"/>
@@ -5972,6 +6507,7 @@
           <w:szCs w:val="24"/>
         </w:rPr>
       </w:pPr>
+      <w:proofErr w:type="spellStart"/>
       <w:r>
         <w:rPr>
           <w:rFonts w:ascii="Arial Nova Cond" w:hAnsi="Arial Nova Cond"/>
@@ -5981,7 +6517,68 @@
           <w:sz w:val="24"/>
           <w:szCs w:val="24"/>
         </w:rPr>
-        <w:t xml:space="preserve">Demikian Berita Acara Pengawasan Lingkungan Hidup pada lokasi kegiatan </w:t>
+        <w:lastRenderedPageBreak/>
+        <w:t>Demikian</w:t>
+      </w:r>
+      <w:proofErr w:type="spellEnd"/>
+      <w:r>
+        <w:rPr>
+          <w:rFonts w:ascii="Arial Nova Cond" w:hAnsi="Arial Nova Cond"/>
+          <w:b w:val="0"/>
+          <w:bCs w:val="0"/>
+          <w:color w:val="0D0D0D"/>
+          <w:sz w:val="24"/>
+          <w:szCs w:val="24"/>
+        </w:rPr>
+        <w:t xml:space="preserve"> </w:t>
+      </w:r>
+      <w:proofErr w:type="spellStart"/>
+      <w:r>
+        <w:rPr>
+          <w:rFonts w:ascii="Arial Nova Cond" w:hAnsi="Arial Nova Cond"/>
+          <w:b w:val="0"/>
+          <w:bCs w:val="0"/>
+          <w:color w:val="0D0D0D"/>
+          <w:sz w:val="24"/>
+          <w:szCs w:val="24"/>
+        </w:rPr>
+        <w:t>Berita</w:t>
+      </w:r>
+      <w:proofErr w:type="spellEnd"/>
+      <w:r>
+        <w:rPr>
+          <w:rFonts w:ascii="Arial Nova Cond" w:hAnsi="Arial Nova Cond"/>
+          <w:b w:val="0"/>
+          <w:bCs w:val="0"/>
+          <w:color w:val="0D0D0D"/>
+          <w:sz w:val="24"/>
+          <w:szCs w:val="24"/>
+        </w:rPr>
+        <w:t xml:space="preserve"> Acara </w:t>
+      </w:r>
+      <w:proofErr w:type="spellStart"/>
+      <w:r>
+        <w:rPr>
+          <w:rFonts w:ascii="Arial Nova Cond" w:hAnsi="Arial Nova Cond"/>
+          <w:b w:val="0"/>
+          <w:bCs w:val="0"/>
+          <w:color w:val="0D0D0D"/>
+          <w:sz w:val="24"/>
+          <w:szCs w:val="24"/>
+        </w:rPr>
+        <w:t>Pengawasan</w:t>
+      </w:r>
+      <w:proofErr w:type="spellEnd"/>
+      <w:r>
+        <w:rPr>
+          <w:rFonts w:ascii="Arial Nova Cond" w:hAnsi="Arial Nova Cond"/>
+          <w:b w:val="0"/>
+          <w:bCs w:val="0"/>
+          <w:color w:val="0D0D0D"/>
+          <w:sz w:val="24"/>
+          <w:szCs w:val="24"/>
+        </w:rPr>
+        <w:t xml:space="preserve"> Lingkungan Hidup pada lokasi kegiatan </w:t>
       </w:r>
       <w:r>
         <w:rPr>
@@ -6827,13 +7424,41 @@
                               <w:szCs w:val="20"/>
                             </w:rPr>
                           </w:pPr>
+                          <w:proofErr w:type="spellStart"/>
                           <w:r>
                             <w:rPr>
                               <w:rFonts w:ascii="Arial Nova Cond" w:hAnsi="Arial Nova Cond"/>
                               <w:sz w:val="20"/>
                               <w:szCs w:val="20"/>
                             </w:rPr>
-                            <w:t xml:space="preserve">Paraf Tim Pengawas </w:t>
+                            <w:t>Paraf</w:t>
+                          </w:r>
+                          <w:proofErr w:type="spellEnd"/>
+                          <w:r>
+                            <w:rPr>
+                              <w:rFonts w:ascii="Arial Nova Cond" w:hAnsi="Arial Nova Cond"/>
+                              <w:sz w:val="20"/>
+                              <w:szCs w:val="20"/>
+                            </w:rPr>
+                            <w:t xml:space="preserve"> Tim </w:t>
+                          </w:r>
+                          <w:proofErr w:type="spellStart"/>
+                          <w:r>
+                            <w:rPr>
+                              <w:rFonts w:ascii="Arial Nova Cond" w:hAnsi="Arial Nova Cond"/>
+                              <w:sz w:val="20"/>
+                              <w:szCs w:val="20"/>
+                            </w:rPr>
+                            <w:t>Pengawas</w:t>
+                          </w:r>
+                          <w:proofErr w:type="spellEnd"/>
+                          <w:r>
+                            <w:rPr>
+                              <w:rFonts w:ascii="Arial Nova Cond" w:hAnsi="Arial Nova Cond"/>
+                              <w:sz w:val="20"/>
+                              <w:szCs w:val="20"/>
+                            </w:rPr>
+                            <w:t xml:space="preserve"> </w:t>
                           </w:r>
                           <w:r>
                             <w:rPr>
@@ -6841,7 +7466,7 @@
                               <w:sz w:val="20"/>
                               <w:szCs w:val="20"/>
                             </w:rPr>
-                            <w:t>{%paraf_pengawas}</w:t>
+                            <w:t>……………….</w:t>
                           </w:r>
                         </w:p>
                         <w:p>
@@ -6890,13 +7515,41 @@
                         <w:szCs w:val="20"/>
                       </w:rPr>
                     </w:pPr>
+                    <w:proofErr w:type="spellStart"/>
                     <w:r>
                       <w:rPr>
                         <w:rFonts w:ascii="Arial Nova Cond" w:hAnsi="Arial Nova Cond"/>
                         <w:sz w:val="20"/>
                         <w:szCs w:val="20"/>
                       </w:rPr>
-                      <w:t xml:space="preserve">Paraf Tim Pengawas </w:t>
+                      <w:t>Paraf</w:t>
+                    </w:r>
+                    <w:proofErr w:type="spellEnd"/>
+                    <w:r>
+                      <w:rPr>
+                        <w:rFonts w:ascii="Arial Nova Cond" w:hAnsi="Arial Nova Cond"/>
+                        <w:sz w:val="20"/>
+                        <w:szCs w:val="20"/>
+                      </w:rPr>
+                      <w:t xml:space="preserve"> Tim </w:t>
+                    </w:r>
+                    <w:proofErr w:type="spellStart"/>
+                    <w:r>
+                      <w:rPr>
+                        <w:rFonts w:ascii="Arial Nova Cond" w:hAnsi="Arial Nova Cond"/>
+                        <w:sz w:val="20"/>
+                        <w:szCs w:val="20"/>
+                      </w:rPr>
+                      <w:t>Pengawas</w:t>
+                    </w:r>
+                    <w:proofErr w:type="spellEnd"/>
+                    <w:r>
+                      <w:rPr>
+                        <w:rFonts w:ascii="Arial Nova Cond" w:hAnsi="Arial Nova Cond"/>
+                        <w:sz w:val="20"/>
+                        <w:szCs w:val="20"/>
+                      </w:rPr>
+                      <w:t xml:space="preserve"> </w:t>
                     </w:r>
                     <w:r>
                       <w:rPr>
@@ -6904,7 +7557,7 @@
                         <w:sz w:val="20"/>
                         <w:szCs w:val="20"/>
                       </w:rPr>
-                      <w:t>{%paraf_pengawas}</w:t>
+                      <w:t>……………….</w:t>
                     </w:r>
                   </w:p>
                   <w:p>
@@ -6981,7 +7634,43 @@
                               <w:sz w:val="20"/>
                               <w:szCs w:val="20"/>
                             </w:rPr>
-                            <w:t xml:space="preserve">Paraf Pihak Usaha/ Kegiatan </w:t>
+                            <w:t xml:space="preserve">Paraf </w:t>
+                          </w:r>
+                          <w:proofErr w:type="spellStart"/>
+                          <w:r>
+                            <w:rPr>
+                              <w:rFonts w:ascii="Arial Nova Cond" w:hAnsi="Arial Nova Cond" w:cs="Arial"/>
+                              <w:sz w:val="20"/>
+                              <w:szCs w:val="20"/>
+                            </w:rPr>
+                            <w:t>Pihak</w:t>
+                          </w:r>
+                          <w:proofErr w:type="spellEnd"/>
+                          <w:r>
+                            <w:rPr>
+                              <w:rFonts w:ascii="Arial Nova Cond" w:hAnsi="Arial Nova Cond" w:cs="Arial"/>
+                              <w:sz w:val="20"/>
+                              <w:szCs w:val="20"/>
+                            </w:rPr>
+                            <w:t xml:space="preserve"> Usaha/ </w:t>
+                          </w:r>
+                          <w:proofErr w:type="spellStart"/>
+                          <w:r>
+                            <w:rPr>
+                              <w:rFonts w:ascii="Arial Nova Cond" w:hAnsi="Arial Nova Cond" w:cs="Arial"/>
+                              <w:sz w:val="20"/>
+                              <w:szCs w:val="20"/>
+                            </w:rPr>
+                            <w:t>Kegiatan</w:t>
+                          </w:r>
+                          <w:proofErr w:type="spellEnd"/>
+                          <w:r>
+                            <w:rPr>
+                              <w:rFonts w:ascii="Arial Nova Cond" w:hAnsi="Arial Nova Cond" w:cs="Arial"/>
+                              <w:sz w:val="20"/>
+                              <w:szCs w:val="20"/>
+                            </w:rPr>
+                            <w:t xml:space="preserve"> </w:t>
                           </w:r>
                           <w:r>
                             <w:rPr>
@@ -6989,7 +7678,7 @@
                               <w:sz w:val="20"/>
                               <w:szCs w:val="20"/>
                             </w:rPr>
-                            <w:t>{%paraf_pemrakarsa}</w:t>
+                            <w:t>………….</w:t>
                           </w:r>
                         </w:p>
                         <w:p>
@@ -7040,7 +7729,43 @@
                         <w:sz w:val="20"/>
                         <w:szCs w:val="20"/>
                       </w:rPr>
-                      <w:t xml:space="preserve">Paraf Pihak Usaha/ Kegiatan </w:t>
+                      <w:t xml:space="preserve">Paraf </w:t>
+                    </w:r>
+                    <w:proofErr w:type="spellStart"/>
+                    <w:r>
+                      <w:rPr>
+                        <w:rFonts w:ascii="Arial Nova Cond" w:hAnsi="Arial Nova Cond" w:cs="Arial"/>
+                        <w:sz w:val="20"/>
+                        <w:szCs w:val="20"/>
+                      </w:rPr>
+                      <w:t>Pihak</w:t>
+                    </w:r>
+                    <w:proofErr w:type="spellEnd"/>
+                    <w:r>
+                      <w:rPr>
+                        <w:rFonts w:ascii="Arial Nova Cond" w:hAnsi="Arial Nova Cond" w:cs="Arial"/>
+                        <w:sz w:val="20"/>
+                        <w:szCs w:val="20"/>
+                      </w:rPr>
+                      <w:t xml:space="preserve"> Usaha/ </w:t>
+                    </w:r>
+                    <w:proofErr w:type="spellStart"/>
+                    <w:r>
+                      <w:rPr>
+                        <w:rFonts w:ascii="Arial Nova Cond" w:hAnsi="Arial Nova Cond" w:cs="Arial"/>
+                        <w:sz w:val="20"/>
+                        <w:szCs w:val="20"/>
+                      </w:rPr>
+                      <w:t>Kegiatan</w:t>
+                    </w:r>
+                    <w:proofErr w:type="spellEnd"/>
+                    <w:r>
+                      <w:rPr>
+                        <w:rFonts w:ascii="Arial Nova Cond" w:hAnsi="Arial Nova Cond" w:cs="Arial"/>
+                        <w:sz w:val="20"/>
+                        <w:szCs w:val="20"/>
+                      </w:rPr>
+                      <w:t xml:space="preserve"> </w:t>
                     </w:r>
                     <w:r>
                       <w:rPr>
@@ -7048,7 +7773,7 @@
                         <w:sz w:val="20"/>
                         <w:szCs w:val="20"/>
                       </w:rPr>
-                      <w:t>{%paraf_pemrakarsa}</w:t>
+                      <w:t>………….</w:t>
                     </w:r>
                   </w:p>
                   <w:p>

</xml_diff>